<commit_message>
feat: add 2026-09-13 daily finance report
</commit_message>
<xml_diff>
--- a/archives/2026-09-13/每日金融快讯_20260913.docx
+++ b/archives/2026-09-13/每日金融快讯_20260913.docx
@@ -157,7 +157,7 @@
         </w:numPr>
       </w:pPr>
       <w:r>
-        <w:t xml:space="preserve">↓ 全球'加息周'临近：美国8月核心CPI环比0.3%超预期+PPI同比5.4%超预期，10年期美债冲上5.00%（2023年10月以来新高），美联储9月加息概率约90%，欧洲央行官员也在考虑10月加息，美元指数从98回升至99.09</w:t>
+        <w:t xml:space="preserve">↓ 全球'加息周'临近：美国8月核心CPI环比0.3%超预期+PPI同比5.4%超预期，10年期美债冲上5.00%（2023年10月以来新高），美联储9月加息概率约90%（高盛/小摩/富国/德银等9家投行连夜改口），欧洲央行9/10已加息25bp落地（存款利率2.25%→2.5%），美元指数从98回升至99.09</w:t>
       </w:r>
     </w:p>
     <w:p>
@@ -217,7 +217,7 @@
         <w:t xml:space="preserve">信号灯：</w:t>
       </w:r>
       <w:r>
-        <w:t xml:space="preserve"> 走弱 </w:t>
+        <w:t xml:space="preserve"> 震荡 </w:t>
       </w:r>
       <w:r>
         <w:rPr>
@@ -1715,7 +1715,7 @@
         <w:t xml:space="preserve">信号灯：</w:t>
       </w:r>
       <w:r>
-        <w:t xml:space="preserve"> ↑升值 </w:t>
+        <w:t xml:space="preserve"> 持平 </w:t>
       </w:r>
       <w:r>
         <w:rPr>
@@ -3025,7 +3025,7 @@
         <w:t xml:space="preserve">信号灯：</w:t>
       </w:r>
       <w:r>
-        <w:t xml:space="preserve"> 收益率上行 </w:t>
+        <w:t xml:space="preserve"> 持平 </w:t>
       </w:r>
       <w:r>
         <w:rPr>
@@ -3586,6 +3586,88 @@
               <w:jc w:val="center"/>
             </w:pPr>
             <w:r>
+              <w:t xml:space="preserve">美国2年期国债收益率</w:t>
+            </w:r>
+          </w:p>
+        </w:tc>
+        <w:tc>
+          <w:tcPr>
+            <w:tcW w:type="dxa" w:w="2256"/>
+            <w:tcBorders>
+              <w:top w:val="single" w:color="CCCCCC" w:sz="1"/>
+              <w:left w:val="single" w:color="CCCCCC" w:sz="1"/>
+              <w:bottom w:val="single" w:color="CCCCCC" w:sz="1"/>
+              <w:right w:val="single" w:color="CCCCCC" w:sz="1"/>
+            </w:tcBorders>
+            <w:vAlign w:val="center"/>
+          </w:tcPr>
+          <w:p>
+            <w:pPr>
+              <w:jc w:val="center"/>
+            </w:pPr>
+            <w:r>
+              <w:t xml:space="preserve">4.594%</w:t>
+            </w:r>
+          </w:p>
+        </w:tc>
+        <w:tc>
+          <w:tcPr>
+            <w:tcW w:type="dxa" w:w="2256"/>
+            <w:tcBorders>
+              <w:top w:val="single" w:color="CCCCCC" w:sz="1"/>
+              <w:left w:val="single" w:color="CCCCCC" w:sz="1"/>
+              <w:bottom w:val="single" w:color="CCCCCC" w:sz="1"/>
+              <w:right w:val="single" w:color="CCCCCC" w:sz="1"/>
+            </w:tcBorders>
+            <w:vAlign w:val="center"/>
+          </w:tcPr>
+          <w:p>
+            <w:pPr>
+              <w:jc w:val="center"/>
+            </w:pPr>
+            <w:r>
+              <w:t xml:space="preserve">9/10 PPI公布后涨超15bp</w:t>
+            </w:r>
+          </w:p>
+        </w:tc>
+        <w:tc>
+          <w:tcPr>
+            <w:tcW w:type="dxa" w:w="2256"/>
+            <w:tcBorders>
+              <w:top w:val="single" w:color="CCCCCC" w:sz="1"/>
+              <w:left w:val="single" w:color="CCCCCC" w:sz="1"/>
+              <w:bottom w:val="single" w:color="CCCCCC" w:sz="1"/>
+              <w:right w:val="single" w:color="CCCCCC" w:sz="1"/>
+            </w:tcBorders>
+            <w:vAlign w:val="center"/>
+          </w:tcPr>
+          <w:p>
+            <w:pPr>
+              <w:jc w:val="center"/>
+            </w:pPr>
+            <w:r>
+              <w:t xml:space="preserve">9/10收盘</w:t>
+            </w:r>
+          </w:p>
+        </w:tc>
+      </w:tr>
+      <w:tr>
+        <w:tc>
+          <w:tcPr>
+            <w:tcW w:type="dxa" w:w="2256"/>
+            <w:tcBorders>
+              <w:top w:val="single" w:color="CCCCCC" w:sz="1"/>
+              <w:left w:val="single" w:color="CCCCCC" w:sz="1"/>
+              <w:bottom w:val="single" w:color="CCCCCC" w:sz="1"/>
+              <w:right w:val="single" w:color="CCCCCC" w:sz="1"/>
+            </w:tcBorders>
+            <w:vAlign w:val="center"/>
+          </w:tcPr>
+          <w:p>
+            <w:pPr>
+              <w:jc w:val="center"/>
+            </w:pPr>
+            <w:r>
               <w:t xml:space="preserve">中美10年期利差</w:t>
             </w:r>
           </w:p>
@@ -3727,7 +3809,7 @@
         <w:t xml:space="preserve">信号灯：</w:t>
       </w:r>
       <w:r>
-        <w:t xml:space="preserve"> 利率上行 </w:t>
+        <w:t xml:space="preserve"> 持平 </w:t>
       </w:r>
       <w:r>
         <w:rPr>
@@ -4955,7 +5037,7 @@
         <w:t xml:space="preserve">信号灯：</w:t>
       </w:r>
       <w:r>
-        <w:t xml:space="preserve"> 油价攀升 </w:t>
+        <w:t xml:space="preserve"> 震荡 </w:t>
       </w:r>
       <w:r>
         <w:rPr>
@@ -5833,7 +5915,7 @@
         <w:t xml:space="preserve">信号灯：</w:t>
       </w:r>
       <w:r>
-        <w:t xml:space="preserve"> 铜价走弱 </w:t>
+        <w:t xml:space="preserve"> 震荡 </w:t>
       </w:r>
       <w:r>
         <w:rPr>
@@ -6429,7 +6511,7 @@
         <w:t xml:space="preserve">信号灯：</w:t>
       </w:r>
       <w:r>
-        <w:t xml:space="preserve"> 美元走强 </w:t>
+        <w:t xml:space="preserve"> 震荡 </w:t>
       </w:r>
       <w:r>
         <w:rPr>
@@ -6973,6 +7055,88 @@
           </w:p>
         </w:tc>
       </w:tr>
+      <w:tr>
+        <w:tc>
+          <w:tcPr>
+            <w:tcW w:type="dxa" w:w="2256"/>
+            <w:tcBorders>
+              <w:top w:val="single" w:color="CCCCCC" w:sz="1"/>
+              <w:left w:val="single" w:color="CCCCCC" w:sz="1"/>
+              <w:bottom w:val="single" w:color="CCCCCC" w:sz="1"/>
+              <w:right w:val="single" w:color="CCCCCC" w:sz="1"/>
+            </w:tcBorders>
+            <w:vAlign w:val="center"/>
+          </w:tcPr>
+          <w:p>
+            <w:pPr>
+              <w:jc w:val="center"/>
+            </w:pPr>
+            <w:r>
+              <w:t xml:space="preserve">欧洲央行9/10决议</w:t>
+            </w:r>
+          </w:p>
+        </w:tc>
+        <w:tc>
+          <w:tcPr>
+            <w:tcW w:type="dxa" w:w="2256"/>
+            <w:tcBorders>
+              <w:top w:val="single" w:color="CCCCCC" w:sz="1"/>
+              <w:left w:val="single" w:color="CCCCCC" w:sz="1"/>
+              <w:bottom w:val="single" w:color="CCCCCC" w:sz="1"/>
+              <w:right w:val="single" w:color="CCCCCC" w:sz="1"/>
+            </w:tcBorders>
+            <w:vAlign w:val="center"/>
+          </w:tcPr>
+          <w:p>
+            <w:pPr>
+              <w:jc w:val="center"/>
+            </w:pPr>
+            <w:r>
+              <w:t xml:space="preserve">三大关键利率+25bp·存款利率2.5%</w:t>
+            </w:r>
+          </w:p>
+        </w:tc>
+        <w:tc>
+          <w:tcPr>
+            <w:tcW w:type="dxa" w:w="2256"/>
+            <w:tcBorders>
+              <w:top w:val="single" w:color="CCCCCC" w:sz="1"/>
+              <w:left w:val="single" w:color="CCCCCC" w:sz="1"/>
+              <w:bottom w:val="single" w:color="CCCCCC" w:sz="1"/>
+              <w:right w:val="single" w:color="CCCCCC" w:sz="1"/>
+            </w:tcBorders>
+            <w:vAlign w:val="center"/>
+          </w:tcPr>
+          <w:p>
+            <w:pPr>
+              <w:jc w:val="center"/>
+            </w:pPr>
+            <w:r>
+              <w:t xml:space="preserve">伊朗战争以来第二次加息·上调2026年CPI预测至3%</w:t>
+            </w:r>
+          </w:p>
+        </w:tc>
+        <w:tc>
+          <w:tcPr>
+            <w:tcW w:type="dxa" w:w="2256"/>
+            <w:tcBorders>
+              <w:top w:val="single" w:color="CCCCCC" w:sz="1"/>
+              <w:left w:val="single" w:color="CCCCCC" w:sz="1"/>
+              <w:bottom w:val="single" w:color="CCCCCC" w:sz="1"/>
+              <w:right w:val="single" w:color="CCCCCC" w:sz="1"/>
+            </w:tcBorders>
+            <w:vAlign w:val="center"/>
+          </w:tcPr>
+          <w:p>
+            <w:pPr>
+              <w:jc w:val="center"/>
+            </w:pPr>
+            <w:r>
+              <w:t xml:space="preserve">9/10落地</w:t>
+            </w:r>
+          </w:p>
+        </w:tc>
+      </w:tr>
     </w:tbl>
     <w:p>
       <w:r>
@@ -6983,7 +7147,7 @@
         <w:t xml:space="preserve">大白话：</w:t>
       </w:r>
       <w:r>
-        <w:t xml:space="preserve"> 美元触底反弹：美元指数从9/8亚市的跌破98回升至99.09——美国8月核心CPI环比0.3%超预期后，市场对美联储下周加息的押注从71.3%（9/10 PPI后）飙至约90%，美元获得加息预期支撑。高盛由'维持不变'转向'预计9月加息25bp'，摩根大通预计9月和12月各加息25bp。但美元周五反弹力度有限（9/12报99.09基本持平），加息预期已高度定价，'利好兑现'逻辑下FOMC落地后美元存在冲高回落风险。特朗普继续放话：称伊朗冲突将在中期选举后结束、不后悔发动对伊朗武力打击。欧洲央行官员也在考虑10月加息。简单说：美元被加息预期托着回到99上方，下周FOMC落地后看是否'利好出尽'。</w:t>
+        <w:t xml:space="preserve"> 美元触底反弹：美元指数从9/8亚市的跌破98回升至99.09——美国8月核心CPI环比0.3%超预期后，市场对美联储下周加息的押注从71.3%（9/10 PPI后）飙至约90%，美元获得加息预期支撑。高盛由'维持不变'转向'预计9月加息25bp'，摩根大通预计9月和12月各加息25bp。但美元周五反弹力度有限（9/12报99.09基本持平），加息预期已高度定价，'利好兑现'逻辑下FOMC落地后美元存在冲高回落风险。特朗普继续放话：称伊朗冲突将在中期选举后结束、不后悔发动对伊朗武力打击。欧洲央行已于9/10加息25bp落地（存款利率2.25%→2.5%，为伊朗战争推高能源价格以来第二次加息），并上调2026年CPI预测至3%（此前2.6%），拉加德对后续行动持谨慎态度。简单说：美元被加息预期托着回到99上方，下周FOMC落地后看是否'利好出尽'。</w:t>
       </w:r>
     </w:p>
     <w:p>
@@ -6995,7 +7159,7 @@
         <w:t xml:space="preserve">机构观点：</w:t>
       </w:r>
       <w:r>
-        <w:t xml:space="preserve"> CME FedWatch 9/11-9/12：9月加息25bp概率约90%（从9/10的71.3%、9/8的60.4%连续飙升）；高盛由'维持不变'转向'9月加息25bp'；摩根大通预计9月和12月各加息25bp；天风固收：9月加息或已成定局，市场分歧已从'加不加息'转变成'加几次'，基准情形是累计约75bp的'信誉性加息'——为强化美联储信誉与独立性、遏制美债抛售，而非启动新一轮连续紧缩周期；华泰宏观：8月核心通胀环比超预期使9月加息成为'必选项'，不加息的公信力风险进一步上行；欧洲央行官员预计将进一步收紧政策，10月加息已在考虑之中。 — CME FedWatch/高盛/摩根大通/天风/华泰 CME FedWatch+高盛+小摩+天风固收+华泰宏观</w:t>
+        <w:t xml:space="preserve"> CME FedWatch 9/11-9/12：9月加息25bp概率约90%（从9/10的71.3%、9/8的60.4%连续飙升）；高盛由'维持不变'转向'9月加息25bp'；摩根大通预计9月和12月各加息25bp；据金投网统计，高盛、小摩、富国、德银等9家投行在CPI公布当晚连夜改口转向9月加息（德银预计75bp、MPA Macro预计50bp）；天风固收：9月加息或已成定局，市场分歧已从'加不加息'转变成'加几次'，基准情形是累计约75bp的'信誉性加息'——为强化美联储信誉与独立性、遏制美债抛售，而非启动新一轮连续紧缩周期；华泰宏观：8月核心通胀环比超预期使9月加息成为'必选项'，不加息的公信力风险进一步上行。 — CME FedWatch/高盛/摩根大通/天风/华泰 CME FedWatch+高盛+小摩+天风固收+华泰宏观</w:t>
       </w:r>
     </w:p>
     <w:p>
@@ -7036,6 +7200,30 @@
     </w:p>
     <w:p>
       <w:pPr>
+        <w:pStyle w:val="ListParagraph"/>
+        <w:numPr>
+          <w:ilvl w:val="0"/>
+          <w:numId w:val="13"/>
+        </w:numPr>
+      </w:pPr>
+      <w:r>
+        <w:t xml:space="preserve">[A级] 证券时报·高盛小摩重大转变（FedWatch 9月加息概率接近90%） (9/12 17:50) https://www.stcn.com/article/detail/4182866.html</w:t>
+      </w:r>
+    </w:p>
+    <w:p>
+      <w:pPr>
+        <w:pStyle w:val="ListParagraph"/>
+        <w:numPr>
+          <w:ilvl w:val="0"/>
+          <w:numId w:val="13"/>
+        </w:numPr>
+      </w:pPr>
+      <w:r>
+        <w:t xml:space="preserve">[S级] 新华财经·欧洲央行加息25bp落地（存款利率2.25%→2.5%，后续谨慎） (9/10 20:44) https://baijiahao.baidu.com/s?id=1875950286586470363&amp;wfr=spider&amp;for=pc</w:t>
+      </w:r>
+    </w:p>
+    <w:p>
+      <w:pPr>
         <w:pStyle w:val="Heading3"/>
         <w:spacing w:after="120" w:before="120"/>
         <w:outlineLvl w:val="2"/>
@@ -7061,7 +7249,7 @@
         <w:t xml:space="preserve">信号灯：</w:t>
       </w:r>
       <w:r>
-        <w:t xml:space="preserve"> 美股走弱 </w:t>
+        <w:t xml:space="preserve"> 震荡 </w:t>
       </w:r>
       <w:r>
         <w:rPr>
@@ -8593,6 +8781,170 @@
             </w:pPr>
             <w:r>
               <w:t xml:space="preserve">9/12</w:t>
+            </w:r>
+          </w:p>
+        </w:tc>
+      </w:tr>
+      <w:tr>
+        <w:tc>
+          <w:tcPr>
+            <w:tcW w:type="dxa" w:w="2256"/>
+            <w:tcBorders>
+              <w:top w:val="single" w:color="CCCCCC" w:sz="1"/>
+              <w:left w:val="single" w:color="CCCCCC" w:sz="1"/>
+              <w:bottom w:val="single" w:color="CCCCCC" w:sz="1"/>
+              <w:right w:val="single" w:color="CCCCCC" w:sz="1"/>
+            </w:tcBorders>
+            <w:vAlign w:val="center"/>
+          </w:tcPr>
+          <w:p>
+            <w:pPr>
+              <w:jc w:val="center"/>
+            </w:pPr>
+            <w:r>
+              <w:t xml:space="preserve">A</w:t>
+            </w:r>
+          </w:p>
+        </w:tc>
+        <w:tc>
+          <w:tcPr>
+            <w:tcW w:type="dxa" w:w="2256"/>
+            <w:tcBorders>
+              <w:top w:val="single" w:color="CCCCCC" w:sz="1"/>
+              <w:left w:val="single" w:color="CCCCCC" w:sz="1"/>
+              <w:bottom w:val="single" w:color="CCCCCC" w:sz="1"/>
+              <w:right w:val="single" w:color="CCCCCC" w:sz="1"/>
+            </w:tcBorders>
+            <w:vAlign w:val="center"/>
+          </w:tcPr>
+          <w:p>
+            <w:pPr>
+              <w:jc w:val="center"/>
+            </w:pPr>
+            <w:r>
+              <w:t xml:space="preserve">新华财经</w:t>
+            </w:r>
+          </w:p>
+        </w:tc>
+        <w:tc>
+          <w:tcPr>
+            <w:tcW w:type="dxa" w:w="2256"/>
+            <w:tcBorders>
+              <w:top w:val="single" w:color="CCCCCC" w:sz="1"/>
+              <w:left w:val="single" w:color="CCCCCC" w:sz="1"/>
+              <w:bottom w:val="single" w:color="CCCCCC" w:sz="1"/>
+              <w:right w:val="single" w:color="CCCCCC" w:sz="1"/>
+            </w:tcBorders>
+            <w:vAlign w:val="center"/>
+          </w:tcPr>
+          <w:p>
+            <w:pPr>
+              <w:jc w:val="center"/>
+            </w:pPr>
+            <w:r>
+              <w:t xml:space="preserve">欧洲央行9/10加息25bp落地：存款机制利率2.25%→2.5%、主要再融资利率2.65%、边际贷款利率2.9%；上调2026年CPI预测至3%（此前2.6%）；为伊朗战争推高能源价格以来第二次加息，后续前景不明</w:t>
+            </w:r>
+          </w:p>
+        </w:tc>
+        <w:tc>
+          <w:tcPr>
+            <w:tcW w:type="dxa" w:w="2256"/>
+            <w:tcBorders>
+              <w:top w:val="single" w:color="CCCCCC" w:sz="1"/>
+              <w:left w:val="single" w:color="CCCCCC" w:sz="1"/>
+              <w:bottom w:val="single" w:color="CCCCCC" w:sz="1"/>
+              <w:right w:val="single" w:color="CCCCCC" w:sz="1"/>
+            </w:tcBorders>
+            <w:vAlign w:val="center"/>
+          </w:tcPr>
+          <w:p>
+            <w:pPr>
+              <w:jc w:val="center"/>
+            </w:pPr>
+            <w:r>
+              <w:t xml:space="preserve">9/10 20:44</w:t>
+            </w:r>
+          </w:p>
+        </w:tc>
+      </w:tr>
+      <w:tr>
+        <w:tc>
+          <w:tcPr>
+            <w:tcW w:type="dxa" w:w="2256"/>
+            <w:tcBorders>
+              <w:top w:val="single" w:color="CCCCCC" w:sz="1"/>
+              <w:left w:val="single" w:color="CCCCCC" w:sz="1"/>
+              <w:bottom w:val="single" w:color="CCCCCC" w:sz="1"/>
+              <w:right w:val="single" w:color="CCCCCC" w:sz="1"/>
+            </w:tcBorders>
+            <w:vAlign w:val="center"/>
+          </w:tcPr>
+          <w:p>
+            <w:pPr>
+              <w:jc w:val="center"/>
+            </w:pPr>
+            <w:r>
+              <w:t xml:space="preserve">A</w:t>
+            </w:r>
+          </w:p>
+        </w:tc>
+        <w:tc>
+          <w:tcPr>
+            <w:tcW w:type="dxa" w:w="2256"/>
+            <w:tcBorders>
+              <w:top w:val="single" w:color="CCCCCC" w:sz="1"/>
+              <w:left w:val="single" w:color="CCCCCC" w:sz="1"/>
+              <w:bottom w:val="single" w:color="CCCCCC" w:sz="1"/>
+              <w:right w:val="single" w:color="CCCCCC" w:sz="1"/>
+            </w:tcBorders>
+            <w:vAlign w:val="center"/>
+          </w:tcPr>
+          <w:p>
+            <w:pPr>
+              <w:jc w:val="center"/>
+            </w:pPr>
+            <w:r>
+              <w:t xml:space="preserve">证券时报</w:t>
+            </w:r>
+          </w:p>
+        </w:tc>
+        <w:tc>
+          <w:tcPr>
+            <w:tcW w:type="dxa" w:w="2256"/>
+            <w:tcBorders>
+              <w:top w:val="single" w:color="CCCCCC" w:sz="1"/>
+              <w:left w:val="single" w:color="CCCCCC" w:sz="1"/>
+              <w:bottom w:val="single" w:color="CCCCCC" w:sz="1"/>
+              <w:right w:val="single" w:color="CCCCCC" w:sz="1"/>
+            </w:tcBorders>
+            <w:vAlign w:val="center"/>
+          </w:tcPr>
+          <w:p>
+            <w:pPr>
+              <w:jc w:val="center"/>
+            </w:pPr>
+            <w:r>
+              <w:t xml:space="preserve">美国8月核心CPI超预期后市场定价9月加息概率约90%；高盛转向预计9月加息25bp（此前预期维持不变）、小摩预计9月与12月各加息25bp（芝商所FedWatch）</w:t>
+            </w:r>
+          </w:p>
+        </w:tc>
+        <w:tc>
+          <w:tcPr>
+            <w:tcW w:type="dxa" w:w="2256"/>
+            <w:tcBorders>
+              <w:top w:val="single" w:color="CCCCCC" w:sz="1"/>
+              <w:left w:val="single" w:color="CCCCCC" w:sz="1"/>
+              <w:bottom w:val="single" w:color="CCCCCC" w:sz="1"/>
+              <w:right w:val="single" w:color="CCCCCC" w:sz="1"/>
+            </w:tcBorders>
+            <w:vAlign w:val="center"/>
+          </w:tcPr>
+          <w:p>
+            <w:pPr>
+              <w:jc w:val="center"/>
+            </w:pPr>
+            <w:r>
+              <w:t xml:space="preserve">9/12 17:50</w:t>
             </w:r>
           </w:p>
         </w:tc>

</xml_diff>